<commit_message>
Start each top-level section of the Word docs on a new page
Section 1 stays on the first page with the table of contents; every
later "##" section gets a page break before it. Mermaid diagrams are
capped at a lower height so they stay on the same page as their
section heading. Regenerated docs/word/*.docx.

Co-Authored-By: Claude Opus 5.5 <noreply@anthropic.com>
</commit_message>
<xml_diff>
--- a/docs/word/ghi_chu_ky_thuat.docx
+++ b/docs/word/ghi_chu_ky_thuat.docx
@@ -401,6 +401,7 @@
     <w:p>
       <w:pPr>
         <w:pStyle w:val="Heading1"/>
+        <w:pageBreakBefore/>
       </w:pPr>
       <w:bookmarkStart w:name="muc_2" w:id="1"/>
       <w:r>
@@ -1080,6 +1081,7 @@
     <w:p>
       <w:pPr>
         <w:pStyle w:val="Heading1"/>
+        <w:pageBreakBefore/>
       </w:pPr>
       <w:bookmarkStart w:name="muc_3" w:id="1"/>
       <w:r>
@@ -1332,6 +1334,7 @@
     <w:p>
       <w:pPr>
         <w:pStyle w:val="Heading1"/>
+        <w:pageBreakBefore/>
       </w:pPr>
       <w:bookmarkStart w:name="muc_4" w:id="1"/>
       <w:r>
@@ -1529,7 +1532,7 @@
         </w:rPr>
         <w:t xml:space="preserve">Bổ sung bảng tính kiểm tra bằng Python cho phần slide không cho (từng tháng, từng khoản, từng kênh), làm không quá 1 ngày. Các số cả năm đã có sẵn trong </w:t>
       </w:r>
-      <w:hyperlink w:history="1" r:id="rIdrnp1kxhillb6vmoys7t4s">
+      <w:hyperlink w:history="1" r:id="rId_o44-e0rtpo2di1qe8ec1">
         <w:r>
           <w:rPr>
             <w:rFonts w:ascii="Times New Roman" w:cs="Times New Roman" w:eastAsia="Times New Roman" w:hAnsi="Times New Roman"/>
@@ -1631,6 +1634,7 @@
     <w:p>
       <w:pPr>
         <w:pStyle w:val="Heading1"/>
+        <w:pageBreakBefore/>
       </w:pPr>
       <w:bookmarkStart w:name="muc_5" w:id="1"/>
       <w:r>
@@ -1769,6 +1773,7 @@
     <w:p>
       <w:pPr>
         <w:pStyle w:val="Heading1"/>
+        <w:pageBreakBefore/>
       </w:pPr>
       <w:bookmarkStart w:name="muc_6" w:id="1"/>
       <w:r>
@@ -1794,7 +1799,7 @@
         </w:rPr>
         <w:t xml:space="preserve">Yêu cầu từng trang: xem </w:t>
       </w:r>
-      <w:hyperlink w:history="1" r:id="rIdcpqn-fdms0cz_up01j2vq">
+      <w:hyperlink w:history="1" r:id="rIdbh5q_4hsq-u7qjq5lqarh">
         <w:r>
           <w:rPr>
             <w:rFonts w:ascii="Times New Roman" w:cs="Times New Roman" w:eastAsia="Times New Roman" w:hAnsi="Times New Roman"/>
@@ -1851,6 +1856,7 @@
     <w:p>
       <w:pPr>
         <w:pStyle w:val="Heading1"/>
+        <w:pageBreakBefore/>
       </w:pPr>
       <w:bookmarkStart w:name="muc_7" w:id="1"/>
       <w:r>

</xml_diff>